<commit_message>
Update company profile with CEO, leadership team, and parent group
Added Chirapong Sakullachat (CEO), Pakorn Pathomnupong (Senior Sales
Engineer), Somchai Junlasri (Technical Consultant). Added Sriarayathep
Group as parent company. Updated contact to ichitaglobal.com domain.

https://claude.ai/code/session_015MwGP9edXnAwSrqyGtN9e1
</commit_message>
<xml_diff>
--- a/ichita_company_profile.docx
+++ b/ichita_company_profile.docx
@@ -105,6 +105,36 @@
           <w:sz w:val="20"/>
         </w:rPr>
         <w:t>As the demands of the sugar refinery industry became increasingly sophisticated — with clients seeking greater product diversification — ICHITA was called upon to deliver total turnkey package solutions that ensure final product quality from end to end.</w:t>
+      </w:r>
+    </w:p>
+    <w:p>
+      <w:pPr>
+        <w:spacing w:before="40" w:after="100"/>
+      </w:pPr>
+      <w:r>
+        <w:rPr>
+          <w:rFonts w:ascii="Aeonik" w:hAnsi="Aeonik"/>
+          <w:color w:val="263338"/>
+          <w:sz w:val="20"/>
+        </w:rPr>
+        <w:t xml:space="preserve">ICHITA is part of the </w:t>
+      </w:r>
+      <w:r>
+        <w:rPr>
+          <w:rFonts w:ascii="Aeonik" w:hAnsi="Aeonik"/>
+          <w:b/>
+          <w:color w:val="263338"/>
+          <w:sz w:val="20"/>
+        </w:rPr>
+        <w:t>Sriarayathep Group</w:t>
+      </w:r>
+      <w:r>
+        <w:rPr>
+          <w:rFonts w:ascii="Aeonik" w:hAnsi="Aeonik"/>
+          <w:color w:val="263338"/>
+          <w:sz w:val="20"/>
+        </w:rPr>
+        <w:t xml:space="preserve"> (Srithep Group), which distributes advanced industrial technologies including ion exchange resin, membranes, and adsorbent solutions across Thailand, focusing on water treatment, purification, separation processes, and environmental sustainability.</w:t>
       </w:r>
     </w:p>
     <w:p>
@@ -1288,6 +1318,242 @@
           <w:color w:val="263338"/>
           <w:sz w:val="30"/>
         </w:rPr>
+        <w:t>Leadership</w:t>
+      </w:r>
+    </w:p>
+    <w:tbl>
+      <w:tblPr>
+        <w:tblW w:type="auto" w:w="0"/>
+        <w:jc w:val="center"/>
+        <w:tblLayout w:type="autofit"/>
+        <w:tblLook w:firstColumn="1" w:firstRow="1" w:lastColumn="0" w:lastRow="0" w:noHBand="0" w:noVBand="1" w:val="04A0"/>
+        <w:tblBorders>
+          <w:top w:val="single" w:sz="4" w:space="0" w:color="A0B0B8"/>
+          <w:left w:val="single" w:sz="4" w:space="0" w:color="A0B0B8"/>
+          <w:bottom w:val="single" w:sz="4" w:space="0" w:color="A0B0B8"/>
+          <w:right w:val="single" w:sz="4" w:space="0" w:color="A0B0B8"/>
+          <w:insideH w:val="single" w:sz="4" w:space="0" w:color="A0B0B8"/>
+          <w:insideV w:val="single" w:sz="4" w:space="0" w:color="A0B0B8"/>
+        </w:tblBorders>
+      </w:tblPr>
+      <w:tblGrid>
+        <w:gridCol w:w="4703"/>
+        <w:gridCol w:w="4703"/>
+      </w:tblGrid>
+      <w:tr>
+        <w:trPr>
+          <w:cantSplit/>
+        </w:trPr>
+        <w:tc>
+          <w:tcPr>
+            <w:tcW w:type="dxa" w:w="4703"/>
+            <w:shd w:fill="263338" w:val="clear"/>
+          </w:tcPr>
+          <w:p>
+            <w:pPr>
+              <w:keepNext/>
+              <w:keepLines/>
+              <w:spacing w:before="40" w:after="40"/>
+            </w:pPr>
+            <w:r>
+              <w:rPr>
+                <w:rFonts w:ascii="Aeonik" w:hAnsi="Aeonik"/>
+                <w:b/>
+                <w:color w:val="FFFFFF"/>
+                <w:sz w:val="18"/>
+              </w:rPr>
+              <w:t>Name</w:t>
+            </w:r>
+          </w:p>
+        </w:tc>
+        <w:tc>
+          <w:tcPr>
+            <w:tcW w:type="dxa" w:w="4703"/>
+            <w:shd w:fill="263338" w:val="clear"/>
+          </w:tcPr>
+          <w:p>
+            <w:pPr>
+              <w:keepNext/>
+              <w:keepLines/>
+              <w:spacing w:before="40" w:after="40"/>
+            </w:pPr>
+            <w:r>
+              <w:rPr>
+                <w:rFonts w:ascii="Aeonik" w:hAnsi="Aeonik"/>
+                <w:b/>
+                <w:color w:val="FFFFFF"/>
+                <w:sz w:val="18"/>
+              </w:rPr>
+              <w:t>Role</w:t>
+            </w:r>
+          </w:p>
+        </w:tc>
+      </w:tr>
+      <w:tr>
+        <w:trPr>
+          <w:cantSplit/>
+        </w:trPr>
+        <w:tc>
+          <w:tcPr>
+            <w:tcW w:type="dxa" w:w="4703"/>
+          </w:tcPr>
+          <w:p>
+            <w:pPr>
+              <w:keepNext/>
+              <w:keepLines/>
+              <w:spacing w:before="40" w:after="40"/>
+            </w:pPr>
+            <w:r>
+              <w:rPr>
+                <w:rFonts w:ascii="Aeonik" w:hAnsi="Aeonik"/>
+                <w:color w:val="263338"/>
+                <w:sz w:val="18"/>
+              </w:rPr>
+              <w:t>Chirapong Sakullachat</w:t>
+            </w:r>
+          </w:p>
+        </w:tc>
+        <w:tc>
+          <w:tcPr>
+            <w:tcW w:type="dxa" w:w="4703"/>
+          </w:tcPr>
+          <w:p>
+            <w:pPr>
+              <w:keepNext/>
+              <w:keepLines/>
+              <w:spacing w:before="40" w:after="40"/>
+            </w:pPr>
+            <w:r>
+              <w:rPr>
+                <w:rFonts w:ascii="Aeonik" w:hAnsi="Aeonik"/>
+                <w:color w:val="263338"/>
+                <w:sz w:val="18"/>
+              </w:rPr>
+              <w:t>Chief Executive Officer</w:t>
+            </w:r>
+          </w:p>
+        </w:tc>
+      </w:tr>
+      <w:tr>
+        <w:trPr>
+          <w:cantSplit/>
+        </w:trPr>
+        <w:tc>
+          <w:tcPr>
+            <w:tcW w:type="dxa" w:w="4703"/>
+            <w:shd w:fill="EFF2F3" w:val="clear"/>
+          </w:tcPr>
+          <w:p>
+            <w:pPr>
+              <w:keepNext/>
+              <w:keepLines/>
+              <w:spacing w:before="40" w:after="40"/>
+            </w:pPr>
+            <w:r>
+              <w:rPr>
+                <w:rFonts w:ascii="Aeonik" w:hAnsi="Aeonik"/>
+                <w:color w:val="263338"/>
+                <w:sz w:val="18"/>
+              </w:rPr>
+              <w:t>Pakorn Pathomnupong</w:t>
+            </w:r>
+          </w:p>
+        </w:tc>
+        <w:tc>
+          <w:tcPr>
+            <w:tcW w:type="dxa" w:w="4703"/>
+            <w:shd w:fill="EFF2F3" w:val="clear"/>
+          </w:tcPr>
+          <w:p>
+            <w:pPr>
+              <w:keepNext/>
+              <w:keepLines/>
+              <w:spacing w:before="40" w:after="40"/>
+            </w:pPr>
+            <w:r>
+              <w:rPr>
+                <w:rFonts w:ascii="Aeonik" w:hAnsi="Aeonik"/>
+                <w:color w:val="263338"/>
+                <w:sz w:val="18"/>
+              </w:rPr>
+              <w:t>Senior Sales Engineer</w:t>
+            </w:r>
+          </w:p>
+        </w:tc>
+      </w:tr>
+      <w:tr>
+        <w:trPr>
+          <w:cantSplit/>
+        </w:trPr>
+        <w:tc>
+          <w:tcPr>
+            <w:tcW w:type="dxa" w:w="4703"/>
+          </w:tcPr>
+          <w:p>
+            <w:pPr>
+              <w:keepNext w:val="0"/>
+              <w:keepLines/>
+              <w:spacing w:before="40" w:after="40"/>
+            </w:pPr>
+            <w:r>
+              <w:rPr>
+                <w:rFonts w:ascii="Aeonik" w:hAnsi="Aeonik"/>
+                <w:color w:val="263338"/>
+                <w:sz w:val="18"/>
+              </w:rPr>
+              <w:t>Somchai Junlasri</w:t>
+            </w:r>
+          </w:p>
+        </w:tc>
+        <w:tc>
+          <w:tcPr>
+            <w:tcW w:type="dxa" w:w="4703"/>
+          </w:tcPr>
+          <w:p>
+            <w:pPr>
+              <w:keepNext w:val="0"/>
+              <w:keepLines/>
+              <w:spacing w:before="40" w:after="40"/>
+            </w:pPr>
+            <w:r>
+              <w:rPr>
+                <w:rFonts w:ascii="Aeonik" w:hAnsi="Aeonik"/>
+                <w:color w:val="263338"/>
+                <w:sz w:val="18"/>
+              </w:rPr>
+              <w:t>Technical Consultant</w:t>
+            </w:r>
+          </w:p>
+        </w:tc>
+      </w:tr>
+    </w:tbl>
+    <w:p>
+      <w:pPr>
+        <w:spacing w:before="40" w:after="40"/>
+      </w:pPr>
+    </w:p>
+    <w:p>
+      <w:pPr>
+        <w:spacing w:before="120" w:after="120"/>
+        <w:pBdr>
+          <w:bottom w:val="single" w:sz="6" w:space="1" w:color="2978FF"/>
+        </w:pBdr>
+      </w:pPr>
+    </w:p>
+    <w:p>
+      <w:pPr>
+        <w:pStyle w:val="Heading2"/>
+        <w:pBdr>
+          <w:left w:val="single" w:sz="24" w:space="6" w:color="2978FF"/>
+        </w:pBdr>
+      </w:pPr>
+      <w:r>
+        <w:rPr>
+          <w:rFonts w:ascii="Aeonik" w:hAnsi="Aeonik"/>
+          <w:b/>
+          <w:color w:val="263338"/>
+          <w:sz w:val="30"/>
+        </w:rPr>
         <w:t>Industries Served</w:t>
       </w:r>
     </w:p>
@@ -1944,7 +2210,7 @@
                 <w:color w:val="263338"/>
                 <w:sz w:val="18"/>
               </w:rPr>
-              <w:t>0-2585-1337 / 0-2585-2123</w:t>
+              <w:t>+66 2 585 1344</w:t>
             </w:r>
           </w:p>
         </w:tc>
@@ -1960,7 +2226,7 @@
           </w:tcPr>
           <w:p>
             <w:pPr>
-              <w:keepNext w:val="0"/>
+              <w:keepNext/>
               <w:keepLines/>
               <w:spacing w:before="40" w:after="40"/>
             </w:pPr>
@@ -1982,6 +2248,52 @@
           </w:tcPr>
           <w:p>
             <w:pPr>
+              <w:keepNext/>
+              <w:keepLines/>
+              <w:spacing w:before="40" w:after="40"/>
+            </w:pPr>
+            <w:r>
+              <w:rPr>
+                <w:rFonts w:ascii="Aeonik" w:hAnsi="Aeonik"/>
+                <w:color w:val="263338"/>
+                <w:sz w:val="18"/>
+              </w:rPr>
+              <w:t>ichitaglobal.com</w:t>
+            </w:r>
+          </w:p>
+        </w:tc>
+      </w:tr>
+      <w:tr>
+        <w:trPr>
+          <w:cantSplit/>
+        </w:trPr>
+        <w:tc>
+          <w:tcPr>
+            <w:tcW w:type="dxa" w:w="4703"/>
+          </w:tcPr>
+          <w:p>
+            <w:pPr>
+              <w:keepNext w:val="0"/>
+              <w:keepLines/>
+              <w:spacing w:before="40" w:after="40"/>
+            </w:pPr>
+            <w:r>
+              <w:rPr>
+                <w:rFonts w:ascii="Aeonik" w:hAnsi="Aeonik"/>
+                <w:b/>
+                <w:color w:val="263338"/>
+                <w:sz w:val="18"/>
+              </w:rPr>
+              <w:t>Group</w:t>
+            </w:r>
+          </w:p>
+        </w:tc>
+        <w:tc>
+          <w:tcPr>
+            <w:tcW w:type="dxa" w:w="4703"/>
+          </w:tcPr>
+          <w:p>
+            <w:pPr>
               <w:keepNext w:val="0"/>
               <w:keepLines/>
               <w:spacing w:before="40" w:after="40"/>
@@ -1992,7 +2304,7 @@
                 <w:color w:val="263338"/>
                 <w:sz w:val="18"/>
               </w:rPr>
-              <w:t>ichitathailand.com</w:t>
+              <w:t>Sriarayathep Group</w:t>
             </w:r>
           </w:p>
         </w:tc>
@@ -2104,7 +2416,7 @@
           <w:color w:val="263338"/>
           <w:sz w:val="20"/>
         </w:rPr>
-        <w:t>Tel: 0-2585-1337 / 0-2585-2123</w:t>
+        <w:t>Tel: +66 2 585 1344</w:t>
       </w:r>
     </w:p>
     <w:p>
@@ -2117,7 +2429,7 @@
           <w:color w:val="263338"/>
           <w:sz w:val="20"/>
         </w:rPr>
-        <w:t>Web: ichitathailand.com</w:t>
+        <w:t>Web: ichitaglobal.com</w:t>
       </w:r>
     </w:p>
     <w:p>

</xml_diff>

<commit_message>
Use Ichita logo symbol on title page and add inline image support
- Title page now shows the ICHITA wordmark logo (assets/Ichita_Logo-05.png)
  centered instead of plain text characters
- Added ![caption](path) markdown image syntax support to md_to_docx.py
  with centered layout, auto-caption styling, and placeholder fallback
- Added 3 image placeholders in company profile for water treatment system,
  membrane technology, and industrial process photos

https://claude.ai/code/session_015MwGP9edXnAwSrqyGtN9e1
</commit_message>
<xml_diff>
--- a/ichita_company_profile.docx
+++ b/ichita_company_profile.docx
@@ -4,17 +4,42 @@
   <w:body>
     <w:p>
       <w:pPr>
-        <w:pStyle w:val="Heading1"/>
+        <w:spacing w:before="960" w:after="160"/>
         <w:jc w:val="center"/>
       </w:pPr>
       <w:r>
-        <w:rPr>
-          <w:rFonts w:ascii="Aeonik" w:hAnsi="Aeonik"/>
-          <w:b/>
-          <w:color w:val="263338"/>
-          <w:sz w:val="52"/>
-        </w:rPr>
-        <w:t>ICHITA Co., Ltd.</w:t>
+        <w:drawing>
+          <wp:inline xmlns:a="http://schemas.openxmlformats.org/drawingml/2006/main" xmlns:pic="http://schemas.openxmlformats.org/drawingml/2006/picture">
+            <wp:extent cx="3200400" cy="890027"/>
+            <wp:docPr id="1" name="Picture 1"/>
+            <wp:cNvGraphicFramePr>
+              <a:graphicFrameLocks noChangeAspect="1"/>
+            </wp:cNvGraphicFramePr>
+            <a:graphic>
+              <a:graphicData uri="http://schemas.openxmlformats.org/drawingml/2006/picture">
+                <pic:pic>
+                  <pic:nvPicPr>
+                    <pic:cNvPr id="0" name="Ichita_Logo-05.png"/>
+                    <pic:cNvPicPr/>
+                  </pic:nvPicPr>
+                  <pic:blipFill>
+                    <a:blip r:embed="rId11"/>
+                    <a:stretch>
+                      <a:fillRect/>
+                    </a:stretch>
+                  </pic:blipFill>
+                  <pic:spPr>
+                    <a:xfrm>
+                      <a:off x="0" y="0"/>
+                      <a:ext cx="3200400" cy="890027"/>
+                    </a:xfrm>
+                    <a:prstGeom prst="rect"/>
+                  </pic:spPr>
+                </pic:pic>
+              </a:graphicData>
+            </a:graphic>
+          </wp:inline>
+        </w:drawing>
       </w:r>
     </w:p>
     <w:p>
@@ -487,6 +512,21 @@
     </w:p>
     <w:p>
       <w:pPr>
+        <w:spacing w:before="120" w:after="120"/>
+        <w:jc w:val="center"/>
+      </w:pPr>
+      <w:r>
+        <w:rPr>
+          <w:rFonts w:ascii="Aeonik" w:hAnsi="Aeonik"/>
+          <w:i/>
+          <w:color w:val="788F9C"/>
+          <w:sz w:val="18"/>
+        </w:rPr>
+        <w:t>[Image: ICHITA water treatment system]</w:t>
+      </w:r>
+    </w:p>
+    <w:p>
+      <w:pPr>
         <w:pStyle w:val="Heading3"/>
       </w:pPr>
       <w:r>
@@ -925,6 +965,21 @@
           <w:sz w:val="20"/>
         </w:rPr>
         <w:t xml:space="preserve"> — dissolved gas removal systems</w:t>
+      </w:r>
+    </w:p>
+    <w:p>
+      <w:pPr>
+        <w:spacing w:before="120" w:after="120"/>
+        <w:jc w:val="center"/>
+      </w:pPr>
+      <w:r>
+        <w:rPr>
+          <w:rFonts w:ascii="Aeonik" w:hAnsi="Aeonik"/>
+          <w:i/>
+          <w:color w:val="788F9C"/>
+          <w:sz w:val="18"/>
+        </w:rPr>
+        <w:t>[Image: Membrane separation technology]</w:t>
       </w:r>
     </w:p>
     <w:p>
@@ -1647,6 +1702,21 @@
           <w:sz w:val="20"/>
         </w:rPr>
         <w:t xml:space="preserve"> — industrial water purification, wastewater recycling, ultrapure water systems</w:t>
+      </w:r>
+    </w:p>
+    <w:p>
+      <w:pPr>
+        <w:spacing w:before="120" w:after="120"/>
+        <w:jc w:val="center"/>
+      </w:pPr>
+      <w:r>
+        <w:rPr>
+          <w:rFonts w:ascii="Aeonik" w:hAnsi="Aeonik"/>
+          <w:i/>
+          <w:color w:val="788F9C"/>
+          <w:sz w:val="18"/>
+        </w:rPr>
+        <w:t>[Image: ICHITA industrial process solutions]</w:t>
       </w:r>
     </w:p>
     <w:p>

</xml_diff>

<commit_message>
Rebrand company description to liquid separation and biorefinery process technologies
Updated tagline, about section, history, services, and company info
table to reflect the new positioning as a liquid separation and
biorefinery process technologies provider.

https://claude.ai/code/session_015MwGP9edXnAwSrqyGtN9e1
</commit_message>
<xml_diff>
--- a/ichita_company_profile.docx
+++ b/ichita_company_profile.docx
@@ -78,7 +78,7 @@
           <w:color w:val="2978FF"/>
           <w:sz w:val="24"/>
         </w:rPr>
-        <w:t>Total Water and Process Solution Provider</w:t>
+        <w:t>Liquid Separation and Biorefinery Process Technologies</w:t>
       </w:r>
     </w:p>
     <w:p>
@@ -116,7 +116,7 @@
           <w:color w:val="263338"/>
           <w:sz w:val="20"/>
         </w:rPr>
-        <w:t>ICHITA Co., Ltd. was established in 2002 as an Engineering, Procurement, and Construction (EPC) company specializing in water treatment solutions and process solution consultation for sugar refineries. Over two decades of continuous innovation, ICHITA has grown into a trusted total solution provider for water treatment and industrial process technologies across the food and beverage sector.</w:t>
+        <w:t>ICHITA Co., Ltd. was established in 2002 as an Engineering, Procurement, and Construction (EPC) company specializing in liquid separation and biorefinery process technologies for sugar refineries. Over two decades of continuous innovation, ICHITA has grown into a trusted provider of advanced liquid separation and biorefinery process solutions across the food, beverage, and bioindustry sectors.</w:t>
       </w:r>
     </w:p>
     <w:p>
@@ -159,7 +159,7 @@
           <w:color w:val="263338"/>
           <w:sz w:val="20"/>
         </w:rPr>
-        <w:t xml:space="preserve"> (Srithep Group), which distributes advanced industrial technologies including ion exchange resin, membranes, and adsorbent solutions across Thailand, focusing on water treatment, purification, separation processes, and environmental sustainability.</w:t>
+        <w:t xml:space="preserve"> (Srithep Group), which distributes advanced industrial technologies including ion exchange resin, membranes, and adsorbent solutions across Thailand, focusing on liquid separation, biorefinery processes, and environmental sustainability.</w:t>
       </w:r>
     </w:p>
     <w:p>
@@ -172,7 +172,7 @@
           <w:color w:val="263338"/>
           <w:sz w:val="20"/>
         </w:rPr>
-        <w:t>Today, ICHITA serves as a partner to manufacturers in sugar, sweetener, beverage, and food ingredient industries, delivering advanced separation and purification technologies that drive efficiency, quality, and sustainability.</w:t>
+        <w:t>Today, ICHITA serves as a partner to manufacturers in sugar, sweetener, beverage, and food ingredient industries, delivering advanced liquid separation and biorefinery process technologies that drive efficiency, quality, and sustainability.</w:t>
       </w:r>
     </w:p>
     <w:p>
@@ -308,7 +308,7 @@
                 <w:color w:val="263338"/>
                 <w:sz w:val="18"/>
               </w:rPr>
-              <w:t>Founded as an EPC company for water treatment and sugar refinery process consultation</w:t>
+              <w:t>Founded as an EPC company for liquid separation and sugar refinery biorefinery process consultation</w:t>
             </w:r>
           </w:p>
         </w:tc>
@@ -507,7 +507,7 @@
           <w:color w:val="263338"/>
           <w:sz w:val="20"/>
         </w:rPr>
-        <w:t>ICHITA provides end-to-end EPC services for water treatment systems and industrial process lines. From initial consultation and design through procurement and commissioning, we deliver complete solutions tailored to each client's requirements.</w:t>
+        <w:t>ICHITA provides end-to-end EPC services for liquid separation systems and biorefinery process lines. From initial consultation and design through procurement and commissioning, we deliver complete solutions tailored to each client's requirements.</w:t>
       </w:r>
     </w:p>
     <w:p>
@@ -2092,7 +2092,7 @@
                 <w:color w:val="263338"/>
                 <w:sz w:val="18"/>
               </w:rPr>
-              <w:t>Water Treatment &amp; Process Solutions</w:t>
+              <w:t>Liquid Separation &amp; Biorefinery Process Technologies</w:t>
             </w:r>
           </w:p>
         </w:tc>
@@ -2140,7 +2140,7 @@
                 <w:color w:val="263338"/>
                 <w:sz w:val="18"/>
               </w:rPr>
-              <w:t>Separation Technologies for Food &amp; Beverage</w:t>
+              <w:t>Separation Technologies for Food, Beverage &amp; Bioindustry</w:t>
             </w:r>
           </w:p>
         </w:tc>

</xml_diff>

<commit_message>
Change Sriarayathep reference to affiliate company with SRYA
Updated About Us and Company Information table to reflect ICHITA as
an affiliate company with SRYA (Sriarayathep) instead of part of group.

https://claude.ai/code/session_015MwGP9edXnAwSrqyGtN9e1
</commit_message>
<xml_diff>
--- a/ichita_company_profile.docx
+++ b/ichita_company_profile.docx
@@ -142,7 +142,7 @@
           <w:color w:val="263338"/>
           <w:sz w:val="20"/>
         </w:rPr>
-        <w:t xml:space="preserve">ICHITA is part of the </w:t>
+        <w:t xml:space="preserve">ICHITA is an affiliate company with </w:t>
       </w:r>
       <w:r>
         <w:rPr>
@@ -151,7 +151,7 @@
           <w:color w:val="263338"/>
           <w:sz w:val="20"/>
         </w:rPr>
-        <w:t>Sriarayathep Group</w:t>
+        <w:t>SRYA (Sriarayathep)</w:t>
       </w:r>
       <w:r>
         <w:rPr>
@@ -159,7 +159,7 @@
           <w:color w:val="263338"/>
           <w:sz w:val="20"/>
         </w:rPr>
-        <w:t xml:space="preserve"> (Srithep Group), which distributes advanced industrial technologies including ion exchange resin, membranes, and adsorbent solutions across Thailand, focusing on liquid separation, biorefinery processes, and environmental sustainability.</w:t>
+        <w:t>, which distributes advanced industrial technologies including ion exchange resin, membranes, and adsorbent solutions across Thailand, focusing on liquid separation, biorefinery processes, and environmental sustainability.</w:t>
       </w:r>
     </w:p>
     <w:p>
@@ -2354,7 +2354,7 @@
                 <w:color w:val="263338"/>
                 <w:sz w:val="18"/>
               </w:rPr>
-              <w:t>Group</w:t>
+              <w:t>Affiliate</w:t>
             </w:r>
           </w:p>
         </w:tc>
@@ -2374,7 +2374,7 @@
                 <w:color w:val="263338"/>
                 <w:sz w:val="18"/>
               </w:rPr>
-              <w:t>Sriarayathep Group</w:t>
+              <w:t>SRYA (Sriarayathep)</w:t>
             </w:r>
           </w:p>
         </w:tc>

</xml_diff>

<commit_message>
Remove Leadership section from company profile
https://claude.ai/code/session_015MwGP9edXnAwSrqyGtN9e1
</commit_message>
<xml_diff>
--- a/ichita_company_profile.docx
+++ b/ichita_company_profile.docx
@@ -1373,242 +1373,6 @@
           <w:color w:val="263338"/>
           <w:sz w:val="30"/>
         </w:rPr>
-        <w:t>Leadership</w:t>
-      </w:r>
-    </w:p>
-    <w:tbl>
-      <w:tblPr>
-        <w:tblW w:type="auto" w:w="0"/>
-        <w:jc w:val="center"/>
-        <w:tblLayout w:type="autofit"/>
-        <w:tblLook w:firstColumn="1" w:firstRow="1" w:lastColumn="0" w:lastRow="0" w:noHBand="0" w:noVBand="1" w:val="04A0"/>
-        <w:tblBorders>
-          <w:top w:val="single" w:sz="4" w:space="0" w:color="A0B0B8"/>
-          <w:left w:val="single" w:sz="4" w:space="0" w:color="A0B0B8"/>
-          <w:bottom w:val="single" w:sz="4" w:space="0" w:color="A0B0B8"/>
-          <w:right w:val="single" w:sz="4" w:space="0" w:color="A0B0B8"/>
-          <w:insideH w:val="single" w:sz="4" w:space="0" w:color="A0B0B8"/>
-          <w:insideV w:val="single" w:sz="4" w:space="0" w:color="A0B0B8"/>
-        </w:tblBorders>
-      </w:tblPr>
-      <w:tblGrid>
-        <w:gridCol w:w="4703"/>
-        <w:gridCol w:w="4703"/>
-      </w:tblGrid>
-      <w:tr>
-        <w:trPr>
-          <w:cantSplit/>
-        </w:trPr>
-        <w:tc>
-          <w:tcPr>
-            <w:tcW w:type="dxa" w:w="4703"/>
-            <w:shd w:fill="263338" w:val="clear"/>
-          </w:tcPr>
-          <w:p>
-            <w:pPr>
-              <w:keepNext/>
-              <w:keepLines/>
-              <w:spacing w:before="40" w:after="40"/>
-            </w:pPr>
-            <w:r>
-              <w:rPr>
-                <w:rFonts w:ascii="Aeonik" w:hAnsi="Aeonik"/>
-                <w:b/>
-                <w:color w:val="FFFFFF"/>
-                <w:sz w:val="18"/>
-              </w:rPr>
-              <w:t>Name</w:t>
-            </w:r>
-          </w:p>
-        </w:tc>
-        <w:tc>
-          <w:tcPr>
-            <w:tcW w:type="dxa" w:w="4703"/>
-            <w:shd w:fill="263338" w:val="clear"/>
-          </w:tcPr>
-          <w:p>
-            <w:pPr>
-              <w:keepNext/>
-              <w:keepLines/>
-              <w:spacing w:before="40" w:after="40"/>
-            </w:pPr>
-            <w:r>
-              <w:rPr>
-                <w:rFonts w:ascii="Aeonik" w:hAnsi="Aeonik"/>
-                <w:b/>
-                <w:color w:val="FFFFFF"/>
-                <w:sz w:val="18"/>
-              </w:rPr>
-              <w:t>Role</w:t>
-            </w:r>
-          </w:p>
-        </w:tc>
-      </w:tr>
-      <w:tr>
-        <w:trPr>
-          <w:cantSplit/>
-        </w:trPr>
-        <w:tc>
-          <w:tcPr>
-            <w:tcW w:type="dxa" w:w="4703"/>
-          </w:tcPr>
-          <w:p>
-            <w:pPr>
-              <w:keepNext/>
-              <w:keepLines/>
-              <w:spacing w:before="40" w:after="40"/>
-            </w:pPr>
-            <w:r>
-              <w:rPr>
-                <w:rFonts w:ascii="Aeonik" w:hAnsi="Aeonik"/>
-                <w:color w:val="263338"/>
-                <w:sz w:val="18"/>
-              </w:rPr>
-              <w:t>Chirapong Sakullachat</w:t>
-            </w:r>
-          </w:p>
-        </w:tc>
-        <w:tc>
-          <w:tcPr>
-            <w:tcW w:type="dxa" w:w="4703"/>
-          </w:tcPr>
-          <w:p>
-            <w:pPr>
-              <w:keepNext/>
-              <w:keepLines/>
-              <w:spacing w:before="40" w:after="40"/>
-            </w:pPr>
-            <w:r>
-              <w:rPr>
-                <w:rFonts w:ascii="Aeonik" w:hAnsi="Aeonik"/>
-                <w:color w:val="263338"/>
-                <w:sz w:val="18"/>
-              </w:rPr>
-              <w:t>Chief Executive Officer</w:t>
-            </w:r>
-          </w:p>
-        </w:tc>
-      </w:tr>
-      <w:tr>
-        <w:trPr>
-          <w:cantSplit/>
-        </w:trPr>
-        <w:tc>
-          <w:tcPr>
-            <w:tcW w:type="dxa" w:w="4703"/>
-            <w:shd w:fill="EFF2F3" w:val="clear"/>
-          </w:tcPr>
-          <w:p>
-            <w:pPr>
-              <w:keepNext/>
-              <w:keepLines/>
-              <w:spacing w:before="40" w:after="40"/>
-            </w:pPr>
-            <w:r>
-              <w:rPr>
-                <w:rFonts w:ascii="Aeonik" w:hAnsi="Aeonik"/>
-                <w:color w:val="263338"/>
-                <w:sz w:val="18"/>
-              </w:rPr>
-              <w:t>Pakorn Pathomnupong</w:t>
-            </w:r>
-          </w:p>
-        </w:tc>
-        <w:tc>
-          <w:tcPr>
-            <w:tcW w:type="dxa" w:w="4703"/>
-            <w:shd w:fill="EFF2F3" w:val="clear"/>
-          </w:tcPr>
-          <w:p>
-            <w:pPr>
-              <w:keepNext/>
-              <w:keepLines/>
-              <w:spacing w:before="40" w:after="40"/>
-            </w:pPr>
-            <w:r>
-              <w:rPr>
-                <w:rFonts w:ascii="Aeonik" w:hAnsi="Aeonik"/>
-                <w:color w:val="263338"/>
-                <w:sz w:val="18"/>
-              </w:rPr>
-              <w:t>Senior Sales Engineer</w:t>
-            </w:r>
-          </w:p>
-        </w:tc>
-      </w:tr>
-      <w:tr>
-        <w:trPr>
-          <w:cantSplit/>
-        </w:trPr>
-        <w:tc>
-          <w:tcPr>
-            <w:tcW w:type="dxa" w:w="4703"/>
-          </w:tcPr>
-          <w:p>
-            <w:pPr>
-              <w:keepNext w:val="0"/>
-              <w:keepLines/>
-              <w:spacing w:before="40" w:after="40"/>
-            </w:pPr>
-            <w:r>
-              <w:rPr>
-                <w:rFonts w:ascii="Aeonik" w:hAnsi="Aeonik"/>
-                <w:color w:val="263338"/>
-                <w:sz w:val="18"/>
-              </w:rPr>
-              <w:t>Somchai Junlasri</w:t>
-            </w:r>
-          </w:p>
-        </w:tc>
-        <w:tc>
-          <w:tcPr>
-            <w:tcW w:type="dxa" w:w="4703"/>
-          </w:tcPr>
-          <w:p>
-            <w:pPr>
-              <w:keepNext w:val="0"/>
-              <w:keepLines/>
-              <w:spacing w:before="40" w:after="40"/>
-            </w:pPr>
-            <w:r>
-              <w:rPr>
-                <w:rFonts w:ascii="Aeonik" w:hAnsi="Aeonik"/>
-                <w:color w:val="263338"/>
-                <w:sz w:val="18"/>
-              </w:rPr>
-              <w:t>Technical Consultant</w:t>
-            </w:r>
-          </w:p>
-        </w:tc>
-      </w:tr>
-    </w:tbl>
-    <w:p>
-      <w:pPr>
-        <w:spacing w:before="40" w:after="40"/>
-      </w:pPr>
-    </w:p>
-    <w:p>
-      <w:pPr>
-        <w:spacing w:before="120" w:after="120"/>
-        <w:pBdr>
-          <w:bottom w:val="single" w:sz="6" w:space="1" w:color="2978FF"/>
-        </w:pBdr>
-      </w:pPr>
-    </w:p>
-    <w:p>
-      <w:pPr>
-        <w:pStyle w:val="Heading2"/>
-        <w:pBdr>
-          <w:left w:val="single" w:sz="24" w:space="6" w:color="2978FF"/>
-        </w:pBdr>
-      </w:pPr>
-      <w:r>
-        <w:rPr>
-          <w:rFonts w:ascii="Aeonik" w:hAnsi="Aeonik"/>
-          <w:b/>
-          <w:color w:val="263338"/>
-          <w:sz w:val="30"/>
-        </w:rPr>
         <w:t>Industries Served</w:t>
       </w:r>
     </w:p>

</xml_diff>

<commit_message>
Update website to www.ichita.co.th
https://claude.ai/code/session_015MwGP9edXnAwSrqyGtN9e1
</commit_message>
<xml_diff>
--- a/ichita_company_profile.docx
+++ b/ichita_company_profile.docx
@@ -2092,7 +2092,7 @@
                 <w:color w:val="263338"/>
                 <w:sz w:val="18"/>
               </w:rPr>
-              <w:t>ichitaglobal.com</w:t>
+              <w:t>www.ichita.co.th</w:t>
             </w:r>
           </w:p>
         </w:tc>
@@ -2263,7 +2263,7 @@
           <w:color w:val="263338"/>
           <w:sz w:val="20"/>
         </w:rPr>
-        <w:t>Web: ichitaglobal.com</w:t>
+        <w:t>Web: www.ichita.co.th</w:t>
       </w:r>
     </w:p>
     <w:p>

</xml_diff>